<commit_message>
Bugs Fixed gerekli düzeltmeler yapıldı
</commit_message>
<xml_diff>
--- a/Assets/Docx/Kontrol_Listesi_VR_Diz_Denge_M_Cigdem.docx
+++ b/Assets/Docx/Kontrol_Listesi_VR_Diz_Denge_M_Cigdem.docx
@@ -1655,7 +1655,13 @@
                 <w:b/>
                 <w:color w:val="C00000"/>
               </w:rPr>
-              <w:t>Hayir</w:t>
+            </w:r>
+            <w:r>
+              <w:rPr>
+                <w:b/>
+                <w:color w:val="008000"/>
+              </w:rPr>
+              <w:t>Evet</w:t>
             </w:r>
           </w:p>
         </w:tc>
@@ -2089,7 +2095,13 @@
                 <w:b/>
                 <w:color w:val="C00000"/>
               </w:rPr>
-              <w:t>Hayir</w:t>
+            </w:r>
+            <w:r>
+              <w:rPr>
+                <w:b/>
+                <w:color w:val="007000"/>
+              </w:rPr>
+              <w:t>Evet</w:t>
             </w:r>
           </w:p>
         </w:tc>
@@ -2151,7 +2163,13 @@
                 <w:b/>
                 <w:color w:val="C00000"/>
               </w:rPr>
-              <w:t>Hayir</w:t>
+            </w:r>
+            <w:r>
+              <w:rPr>
+                <w:b/>
+                <w:color w:val="007000"/>
+              </w:rPr>
+              <w:t>Evet</w:t>
             </w:r>
           </w:p>
         </w:tc>
@@ -2213,7 +2231,13 @@
                 <w:b/>
                 <w:color w:val="C00000"/>
               </w:rPr>
-              <w:t>Hayir</w:t>
+            </w:r>
+            <w:r>
+              <w:rPr>
+                <w:b/>
+                <w:color w:val="008000"/>
+              </w:rPr>
+              <w:t>Evet</w:t>
             </w:r>
           </w:p>
         </w:tc>
@@ -2771,7 +2795,13 @@
                 <w:b/>
                 <w:color w:val="C00000"/>
               </w:rPr>
-              <w:t>Hayir</w:t>
+            </w:r>
+            <w:r>
+              <w:rPr>
+                <w:b/>
+                <w:color w:val="007000"/>
+              </w:rPr>
+              <w:t>Evet</w:t>
             </w:r>
           </w:p>
         </w:tc>
@@ -3515,7 +3545,13 @@
                 <w:b/>
                 <w:color w:val="C00000"/>
               </w:rPr>
-              <w:t>Hayir</w:t>
+            </w:r>
+            <w:r>
+              <w:rPr>
+                <w:b/>
+                <w:color w:val="007000"/>
+              </w:rPr>
+              <w:t>Evet</w:t>
             </w:r>
           </w:p>
         </w:tc>
@@ -4693,7 +4729,13 @@
                 <w:b/>
                 <w:color w:val="C00000"/>
               </w:rPr>
-              <w:t>Hayir</w:t>
+            </w:r>
+            <w:r>
+              <w:rPr>
+                <w:b/>
+                <w:color w:val="007000"/>
+              </w:rPr>
+              <w:t>Evet</w:t>
             </w:r>
           </w:p>
         </w:tc>
@@ -5003,6 +5045,18 @@
                 <w:b/>
                 <w:color w:val="008000"/>
               </w:rPr>
+            </w:r>
+            <w:r>
+              <w:rPr>
+                <w:b/>
+                <w:color w:val="C00000"/>
+              </w:rPr>
+            </w:r>
+            <w:r>
+              <w:rPr>
+                <w:b/>
+                <w:color w:val="008000"/>
+              </w:rPr>
               <w:t>Evet</w:t>
             </w:r>
           </w:p>
@@ -5065,6 +5119,18 @@
                 <w:b/>
                 <w:color w:val="008000"/>
               </w:rPr>
+            </w:r>
+            <w:r>
+              <w:rPr>
+                <w:b/>
+                <w:color w:val="C00000"/>
+              </w:rPr>
+            </w:r>
+            <w:r>
+              <w:rPr>
+                <w:b/>
+                <w:color w:val="008000"/>
+              </w:rPr>
               <w:t>Evet</w:t>
             </w:r>
           </w:p>
@@ -5127,7 +5193,13 @@
                 <w:b/>
                 <w:color w:val="C00000"/>
               </w:rPr>
-              <w:t>Hayir</w:t>
+            </w:r>
+            <w:r>
+              <w:rPr>
+                <w:b/>
+                <w:color w:val="008000"/>
+              </w:rPr>
+              <w:t>Evet</w:t>
             </w:r>
           </w:p>
         </w:tc>
@@ -5313,7 +5385,13 @@
                 <w:b/>
                 <w:color w:val="C00000"/>
               </w:rPr>
-              <w:t>Hayir</w:t>
+            </w:r>
+            <w:r>
+              <w:rPr>
+                <w:b/>
+                <w:color w:val="008000"/>
+              </w:rPr>
+              <w:t>Evet</w:t>
             </w:r>
           </w:p>
         </w:tc>
@@ -5375,7 +5453,13 @@
                 <w:b/>
                 <w:color w:val="C00000"/>
               </w:rPr>
-              <w:t>Hayir</w:t>
+            </w:r>
+            <w:r>
+              <w:rPr>
+                <w:b/>
+                <w:color w:val="008000"/>
+              </w:rPr>
+              <w:t>Evet</w:t>
             </w:r>
           </w:p>
         </w:tc>
@@ -5437,7 +5521,13 @@
                 <w:b/>
                 <w:color w:val="C00000"/>
               </w:rPr>
-              <w:t>Hayir</w:t>
+            </w:r>
+            <w:r>
+              <w:rPr>
+                <w:b/>
+                <w:color w:val="008000"/>
+              </w:rPr>
+              <w:t>Evet</w:t>
             </w:r>
           </w:p>
         </w:tc>
@@ -5499,7 +5589,13 @@
                 <w:b/>
                 <w:color w:val="C00000"/>
               </w:rPr>
-              <w:t>Hayir</w:t>
+            </w:r>
+            <w:r>
+              <w:rPr>
+                <w:b/>
+                <w:color w:val="008000"/>
+              </w:rPr>
+              <w:t>Evet</w:t>
             </w:r>
           </w:p>
         </w:tc>
@@ -5623,7 +5719,13 @@
                 <w:b/>
                 <w:color w:val="C00000"/>
               </w:rPr>
-              <w:t>Hayir</w:t>
+            </w:r>
+            <w:r>
+              <w:rPr>
+                <w:b/>
+                <w:color w:val="008000"/>
+              </w:rPr>
+              <w:t>Evet</w:t>
             </w:r>
           </w:p>
         </w:tc>
@@ -6429,7 +6531,13 @@
                 <w:b/>
                 <w:color w:val="C00000"/>
               </w:rPr>
-              <w:t>Hayir</w:t>
+            </w:r>
+            <w:r>
+              <w:rPr>
+                <w:b/>
+                <w:color w:val="008000"/>
+              </w:rPr>
+              <w:t>Evet</w:t>
             </w:r>
           </w:p>
         </w:tc>
@@ -6739,7 +6847,13 @@
                 <w:b/>
                 <w:color w:val="C00000"/>
               </w:rPr>
-              <w:t>Hayir</w:t>
+            </w:r>
+            <w:r>
+              <w:rPr>
+                <w:b/>
+                <w:color w:val="008000"/>
+              </w:rPr>
+              <w:t>Evet</w:t>
             </w:r>
           </w:p>
         </w:tc>
@@ -6925,7 +7039,13 @@
                 <w:b/>
                 <w:color w:val="C00000"/>
               </w:rPr>
-              <w:t>Hayir</w:t>
+            </w:r>
+            <w:r>
+              <w:rPr>
+                <w:b/>
+                <w:color w:val="008000"/>
+              </w:rPr>
+              <w:t>Evet</w:t>
             </w:r>
           </w:p>
         </w:tc>
@@ -9839,7 +9959,13 @@
                 <w:b/>
                 <w:color w:val="C00000"/>
               </w:rPr>
-              <w:t>Hayir</w:t>
+            </w:r>
+            <w:r>
+              <w:rPr>
+                <w:b/>
+                <w:color w:val="008000"/>
+              </w:rPr>
+              <w:t>Evet</w:t>
             </w:r>
           </w:p>
         </w:tc>

</xml_diff>